<commit_message>
Initial commit - Nâng cấp đặc trưng góc và tối ưu siêu tham số
</commit_message>
<xml_diff>
--- a/Bao cao ky thuat MachineLearning - NguyenThanhTu_23IT296.docx
+++ b/Bao cao ky thuat MachineLearning - NguyenThanhTu_23IT296.docx
@@ -520,7 +520,17 @@
           <w:szCs w:val="28"/>
           <w:lang w:val="vi-VN"/>
         </w:rPr>
-        <w:t xml:space="preserve"> năm 2025</w:t>
+        <w:t xml:space="preserve"> năm 202</w:t>
+      </w:r>
+      <w:r>
+        <w:rPr>
+          <w:b/>
+          <w:bCs/>
+          <w:sz w:val="28"/>
+          <w:szCs w:val="28"/>
+          <w:lang w:val="vi-VN"/>
+        </w:rPr>
+        <w:t>6</w:t>
       </w:r>
     </w:p>
     <w:p>
@@ -548,6 +558,12 @@
           <w:footerReference w:type="first" r:id="rId11"/>
           <w:pgSz w:w="11907" w:h="16840"/>
           <w:pgMar w:top="1134" w:right="1134" w:bottom="1134" w:left="1701" w:header="720" w:footer="720" w:gutter="0"/>
+          <w:pgBorders w:display="firstPage" w:offsetFrom="page">
+            <w:top w:val="twistedLines1" w:sz="18" w:space="24" w:color="auto"/>
+            <w:left w:val="twistedLines1" w:sz="18" w:space="24" w:color="auto"/>
+            <w:bottom w:val="twistedLines1" w:sz="18" w:space="24" w:color="auto"/>
+            <w:right w:val="twistedLines1" w:sz="18" w:space="24" w:color="auto"/>
+          </w:pgBorders>
           <w:pgNumType w:fmt="lowerRoman"/>
           <w:cols w:space="720"/>
         </w:sectPr>
@@ -2641,6 +2657,47 @@
     </w:sdt>
     <w:p>
       <w:pPr>
+        <w:spacing w:line="360" w:lineRule="auto"/>
+        <w:ind w:right="49"/>
+        <w:jc w:val="center"/>
+        <w:rPr>
+          <w:sz w:val="28"/>
+          <w:szCs w:val="24"/>
+          <w:lang w:val="pt-BR"/>
+        </w:rPr>
+      </w:pPr>
+      <w:r>
+        <w:rPr>
+          <w:sz w:val="28"/>
+          <w:szCs w:val="24"/>
+          <w:lang w:val="pt-BR"/>
+        </w:rPr>
+        <w:t>(</w:t>
+      </w:r>
+      <w:hyperlink r:id="rId12" w:history="1">
+        <w:r>
+          <w:rPr>
+            <w:rStyle w:val="Hyperlink"/>
+            <w:b/>
+            <w:bCs/>
+            <w:sz w:val="28"/>
+            <w:szCs w:val="24"/>
+            <w:lang w:val="pt-BR"/>
+          </w:rPr>
+          <w:t>Link Báo cáo+Code</w:t>
+        </w:r>
+      </w:hyperlink>
+      <w:r>
+        <w:rPr>
+          <w:sz w:val="28"/>
+          <w:szCs w:val="24"/>
+          <w:lang w:val="pt-BR"/>
+        </w:rPr>
+        <w:t>)</w:t>
+      </w:r>
+    </w:p>
+    <w:p>
+      <w:pPr>
         <w:spacing w:before="0" w:after="0" w:line="360" w:lineRule="auto"/>
         <w:ind w:firstLine="0"/>
         <w:rPr>
@@ -2960,7 +3017,7 @@
                     <pic:cNvPicPr preferRelativeResize="0"/>
                   </pic:nvPicPr>
                   <pic:blipFill>
-                    <a:blip r:embed="rId12"/>
+                    <a:blip r:embed="rId13"/>
                     <a:srcRect/>
                     <a:stretch>
                       <a:fillRect/>
@@ -4106,6 +4163,7 @@
       </w:pPr>
       <w:r>
         <w:rPr>
+          <w:noProof/>
           <w:lang w:val="vi-VN"/>
         </w:rPr>
         <w:lastRenderedPageBreak/>
@@ -4125,7 +4183,7 @@
                     <pic:cNvPicPr/>
                   </pic:nvPicPr>
                   <pic:blipFill>
-                    <a:blip r:embed="rId13"/>
+                    <a:blip r:embed="rId14"/>
                     <a:stretch>
                       <a:fillRect/>
                     </a:stretch>
@@ -4156,16 +4214,36 @@
         </w:rPr>
       </w:pPr>
       <w:r>
+        <w:rPr>
+          <w:lang w:val="vi-VN"/>
+        </w:rPr>
         <w:t xml:space="preserve">Hình </w:t>
       </w:r>
-      <w:fldSimple w:instr=" SEQ Hình \* ARABIC ">
-        <w:r>
-          <w:rPr>
-            <w:noProof/>
-          </w:rPr>
-          <w:t>2</w:t>
-        </w:r>
-      </w:fldSimple>
+      <w:r>
+        <w:fldChar w:fldCharType="begin"/>
+      </w:r>
+      <w:r>
+        <w:rPr>
+          <w:lang w:val="vi-VN"/>
+        </w:rPr>
+        <w:instrText xml:space="preserve"> SEQ Hình \* ARABIC </w:instrText>
+      </w:r>
+      <w:r>
+        <w:fldChar w:fldCharType="separate"/>
+      </w:r>
+      <w:r>
+        <w:rPr>
+          <w:noProof/>
+          <w:lang w:val="vi-VN"/>
+        </w:rPr>
+        <w:t>2</w:t>
+      </w:r>
+      <w:r>
+        <w:rPr>
+          <w:noProof/>
+        </w:rPr>
+        <w:fldChar w:fldCharType="end"/>
+      </w:r>
       <w:r>
         <w:rPr>
           <w:lang w:val="vi-VN"/>
@@ -4330,7 +4408,7 @@
                     <pic:cNvPicPr preferRelativeResize="0"/>
                   </pic:nvPicPr>
                   <pic:blipFill>
-                    <a:blip r:embed="rId14"/>
+                    <a:blip r:embed="rId15"/>
                     <a:srcRect/>
                     <a:stretch>
                       <a:fillRect/>
@@ -4394,7 +4472,7 @@
                     <pic:cNvPicPr preferRelativeResize="0"/>
                   </pic:nvPicPr>
                   <pic:blipFill>
-                    <a:blip r:embed="rId15"/>
+                    <a:blip r:embed="rId16"/>
                     <a:srcRect/>
                     <a:stretch>
                       <a:fillRect/>
@@ -4647,6 +4725,9 @@
         <w:jc w:val="center"/>
       </w:pPr>
       <w:r>
+        <w:rPr>
+          <w:noProof/>
+        </w:rPr>
         <w:lastRenderedPageBreak/>
         <w:drawing>
           <wp:inline distT="0" distB="0" distL="0" distR="0" wp14:anchorId="6D049A93" wp14:editId="62E8F78C">
@@ -4664,7 +4745,7 @@
                     <pic:cNvPicPr/>
                   </pic:nvPicPr>
                   <pic:blipFill>
-                    <a:blip r:embed="rId16"/>
+                    <a:blip r:embed="rId17"/>
                     <a:stretch>
                       <a:fillRect/>
                     </a:stretch>
@@ -4900,13 +4981,23 @@
         <w:lastRenderedPageBreak/>
         <w:t xml:space="preserve">Khởi tạo mô hình: </w:t>
       </w:r>
+      <w:proofErr w:type="gramStart"/>
       <w:r>
         <w:rPr>
           <w:b/>
           <w:bCs/>
           <w:shd w:val="clear" w:color="auto" w:fill="E9EEF6"/>
         </w:rPr>
-        <w:t>RandomForestClassifier(n_estimators=200, random_state=42)</w:t>
+        <w:t>RandomForestClassifier(</w:t>
+      </w:r>
+      <w:proofErr w:type="gramEnd"/>
+      <w:r>
+        <w:rPr>
+          <w:b/>
+          <w:bCs/>
+          <w:shd w:val="clear" w:color="auto" w:fill="E9EEF6"/>
+        </w:rPr>
+        <w:t>n_estimators=200, random_state=42)</w:t>
       </w:r>
     </w:p>
     <w:p>
@@ -5088,7 +5179,43 @@
           <w:bCs/>
           <w:shd w:val="clear" w:color="auto" w:fill="E9EEF6"/>
         </w:rPr>
-        <w:t>Counter().most_common(1)</w:t>
+        <w:t>Counter(</w:t>
+      </w:r>
+      <w:proofErr w:type="gramStart"/>
+      <w:r>
+        <w:rPr>
+          <w:b/>
+          <w:bCs/>
+          <w:shd w:val="clear" w:color="auto" w:fill="E9EEF6"/>
+        </w:rPr>
+        <w:t>).most</w:t>
+      </w:r>
+      <w:proofErr w:type="gramEnd"/>
+      <w:r>
+        <w:rPr>
+          <w:b/>
+          <w:bCs/>
+          <w:shd w:val="clear" w:color="auto" w:fill="E9EEF6"/>
+        </w:rPr>
+        <w:t>_</w:t>
+      </w:r>
+      <w:proofErr w:type="gramStart"/>
+      <w:r>
+        <w:rPr>
+          <w:b/>
+          <w:bCs/>
+          <w:shd w:val="clear" w:color="auto" w:fill="E9EEF6"/>
+        </w:rPr>
+        <w:t>common(</w:t>
+      </w:r>
+      <w:proofErr w:type="gramEnd"/>
+      <w:r>
+        <w:rPr>
+          <w:b/>
+          <w:bCs/>
+          <w:shd w:val="clear" w:color="auto" w:fill="E9EEF6"/>
+        </w:rPr>
+        <w:t>1)</w:t>
       </w:r>
       <w:r>
         <w:t xml:space="preserve"> để lấy ra nhãn xuất hiện nhiều nhất. Kết hợp với điều kiện chốt khung hình </w:t>
@@ -5306,13 +5433,23 @@
         </w:rPr>
         <w:tab/>
       </w:r>
+      <w:proofErr w:type="gramStart"/>
       <w:r>
         <w:rPr>
           <w:b/>
           <w:bCs/>
           <w:shd w:val="clear" w:color="auto" w:fill="E9EEF6"/>
         </w:rPr>
-        <w:t>IsolationForest(contamination=0.05, random_state=42)</w:t>
+        <w:t>IsolationForest(</w:t>
+      </w:r>
+      <w:proofErr w:type="gramEnd"/>
+      <w:r>
+        <w:rPr>
+          <w:b/>
+          <w:bCs/>
+          <w:shd w:val="clear" w:color="auto" w:fill="E9EEF6"/>
+        </w:rPr>
+        <w:t>contamination=0.05, random_state=42)</w:t>
       </w:r>
     </w:p>
     <w:p>
@@ -5592,34 +5729,47 @@
         </w:rPr>
         <w:lastRenderedPageBreak/>
         <w:drawing>
-          <wp:inline distT="114300" distB="114300" distL="114300" distR="114300" wp14:anchorId="237992CB" wp14:editId="0A014566">
-            <wp:extent cx="3924300" cy="5267325"/>
-            <wp:effectExtent l="0" t="0" r="0" b="0"/>
-            <wp:docPr id="623665421" name="image4.png"/>
-            <wp:cNvGraphicFramePr/>
+          <wp:inline distT="0" distB="0" distL="0" distR="0" wp14:anchorId="4A6991B6" wp14:editId="41E13FA6">
+            <wp:extent cx="5760720" cy="5463540"/>
+            <wp:effectExtent l="0" t="0" r="0" b="3810"/>
+            <wp:docPr id="354135398" name="Picture 1"/>
+            <wp:cNvGraphicFramePr>
+              <a:graphicFrameLocks xmlns:a="http://schemas.openxmlformats.org/drawingml/2006/main" noChangeAspect="1"/>
+            </wp:cNvGraphicFramePr>
             <a:graphic xmlns:a="http://schemas.openxmlformats.org/drawingml/2006/main">
               <a:graphicData uri="http://schemas.openxmlformats.org/drawingml/2006/picture">
                 <pic:pic xmlns:pic="http://schemas.openxmlformats.org/drawingml/2006/picture">
                   <pic:nvPicPr>
-                    <pic:cNvPr id="0" name="image4.png"/>
-                    <pic:cNvPicPr preferRelativeResize="0"/>
+                    <pic:cNvPr id="0" name="Picture 1"/>
+                    <pic:cNvPicPr>
+                      <a:picLocks noChangeAspect="1" noChangeArrowheads="1"/>
+                    </pic:cNvPicPr>
                   </pic:nvPicPr>
                   <pic:blipFill>
-                    <a:blip r:embed="rId12"/>
+                    <a:blip r:embed="rId18">
+                      <a:extLst>
+                        <a:ext uri="{28A0092B-C50C-407E-A947-70E740481C1C}">
+                          <a14:useLocalDpi xmlns:a14="http://schemas.microsoft.com/office/drawing/2010/main" val="0"/>
+                        </a:ext>
+                      </a:extLst>
+                    </a:blip>
                     <a:srcRect/>
                     <a:stretch>
                       <a:fillRect/>
                     </a:stretch>
                   </pic:blipFill>
-                  <pic:spPr>
+                  <pic:spPr bwMode="auto">
                     <a:xfrm>
                       <a:off x="0" y="0"/>
-                      <a:ext cx="3924300" cy="5267325"/>
+                      <a:ext cx="5760720" cy="5463540"/>
                     </a:xfrm>
                     <a:prstGeom prst="rect">
                       <a:avLst/>
                     </a:prstGeom>
-                    <a:ln/>
+                    <a:noFill/>
+                    <a:ln>
+                      <a:noFill/>
+                    </a:ln>
                   </pic:spPr>
                 </pic:pic>
               </a:graphicData>
@@ -6199,16 +6349,23 @@
         <w:spacing w:before="0" w:after="0" w:line="360" w:lineRule="auto"/>
         <w:ind w:firstLine="0"/>
         <w:jc w:val="center"/>
-        <w:rPr>
-          <w:lang w:val="vi-VN"/>
-        </w:rPr>
       </w:pPr>
       <w:r>
         <w:t>=== The End ===</w:t>
       </w:r>
     </w:p>
+    <w:p>
+      <w:pPr>
+        <w:spacing w:before="0" w:after="0" w:line="360" w:lineRule="auto"/>
+        <w:ind w:firstLine="0"/>
+        <w:jc w:val="center"/>
+        <w:rPr>
+          <w:lang w:val="vi-VN"/>
+        </w:rPr>
+      </w:pPr>
+    </w:p>
     <w:sectPr>
-      <w:headerReference w:type="first" r:id="rId17"/>
+      <w:headerReference w:type="first" r:id="rId19"/>
       <w:pgSz w:w="11907" w:h="16840"/>
       <w:pgMar w:top="1134" w:right="1134" w:bottom="1134" w:left="1701" w:header="720" w:footer="720" w:gutter="0"/>
       <w:pgNumType w:start="1"/>
@@ -10261,6 +10418,18 @@
       <w:szCs w:val="18"/>
     </w:rPr>
   </w:style>
+  <w:style w:type="character" w:styleId="UnresolvedMention">
+    <w:name w:val="Unresolved Mention"/>
+    <w:basedOn w:val="DefaultParagraphFont"/>
+    <w:uiPriority w:val="99"/>
+    <w:semiHidden/>
+    <w:unhideWhenUsed/>
+    <w:rsid w:val="003A4018"/>
+    <w:rPr>
+      <w:color w:val="605E5C"/>
+      <w:shd w:val="clear" w:color="auto" w:fill="E1DFDD"/>
+    </w:rPr>
+  </w:style>
 </w:styles>
 </file>
 

</xml_diff>